<commit_message>
Clean Sales Report template: remove DEV NOTE, tier tags, instructional text
</commit_message>
<xml_diff>
--- a/backend/templates/EzTrack_Sales_Report_Template_DevSpec.docx
+++ b/backend/templates/EzTrack_Sales_Report_Template_DevSpec.docx
@@ -21,7 +21,6 @@
           <w:sz w:val="18"/>
           <w:szCs w:val="18"/>
         </w:rPr>
-        <w:t xml:space="preserve">DEV NOTE: This is a template specification, not a fillable form. Fields in </w:t>
       </w:r>
       <w:r>
         <w:rPr>
@@ -31,7 +30,6 @@
           <w:sz w:val="18"/>
           <w:szCs w:val="18"/>
         </w:rPr>
-        <w:t xml:space="preserve">{{orange tags}}</w:t>
       </w:r>
       <w:r>
         <w:rPr>
@@ -41,7 +39,6 @@
           <w:sz w:val="18"/>
           <w:szCs w:val="18"/>
         </w:rPr>
-        <w:t xml:space="preserve"> are data-binding points the AI fills per generation. Sections tagged [SIGLA+] appear for Sigla and Unlad. Sections tagged [UNLAD ONLY] appear only for Unlad. Remove this note block before rendering to the user.</w:t>
       </w:r>
     </w:p>
     <w:p>
@@ -609,7 +606,6 @@
           <w:sz w:val="16"/>
           <w:szCs w:val="16"/>
         </w:rPr>
-        <w:t xml:space="preserve">   [SIGLA+]</w:t>
       </w:r>
     </w:p>
     <w:p>
@@ -716,7 +712,6 @@
           <w:sz w:val="16"/>
           <w:szCs w:val="16"/>
         </w:rPr>
-        <w:t xml:space="preserve">   [SIGLA+]</w:t>
       </w:r>
     </w:p>
     <w:tbl>
@@ -954,7 +949,6 @@
           <w:sz w:val="16"/>
           <w:szCs w:val="16"/>
         </w:rPr>
-        <w:t xml:space="preserve">Repeat row per category: Supplies, Labor, Utilities, Rent, Transportation, Marketing, Miscellaneous. Flag if any category exceeds threshold: </w:t>
       </w:r>
       <w:r>
         <w:rPr>
@@ -964,7 +958,6 @@
           <w:sz w:val="18"/>
           <w:szCs w:val="18"/>
         </w:rPr>
-        <w:t xml:space="preserve">{{unusual_category_flag}}</w:t>
       </w:r>
     </w:p>
     <w:p>
@@ -992,7 +985,6 @@
           <w:sz w:val="16"/>
           <w:szCs w:val="16"/>
         </w:rPr>
-        <w:t xml:space="preserve">   [SIGLA+]</w:t>
       </w:r>
     </w:p>
     <w:p>
@@ -1065,7 +1057,6 @@
           <w:sz w:val="16"/>
           <w:szCs w:val="16"/>
         </w:rPr>
-        <w:t xml:space="preserve">   [UNLAD ONLY]</w:t>
       </w:r>
     </w:p>
     <w:tbl>
@@ -1464,7 +1455,6 @@
           <w:sz w:val="16"/>
           <w:szCs w:val="16"/>
         </w:rPr>
-        <w:t xml:space="preserve">   [UNLAD ONLY]</w:t>
       </w:r>
     </w:p>
     <w:p>
@@ -1547,7 +1537,6 @@
           <w:sz w:val="16"/>
           <w:szCs w:val="16"/>
         </w:rPr>
-        <w:t xml:space="preserve">   [UNLAD ONLY]</w:t>
       </w:r>
     </w:p>
     <w:p>
@@ -1647,7 +1636,6 @@
           <w:sz w:val="16"/>
           <w:szCs w:val="16"/>
         </w:rPr>
-        <w:t xml:space="preserve">   [UNLAD ONLY]</w:t>
       </w:r>
     </w:p>
     <w:tbl>

</xml_diff>